<commit_message>
chore(doc): add link github for document file
</commit_message>
<xml_diff>
--- a/Lab06/assets/TranTuanHung_23659581.docx
+++ b/Lab06/assets/TranTuanHung_23659581.docx
@@ -3,6 +3,12 @@
 <w:document xmlns:wpc="http://schemas.microsoft.com/office/word/2010/wordprocessingCanvas" xmlns:cx="http://schemas.microsoft.com/office/drawing/2014/chartex" xmlns:cx1="http://schemas.microsoft.com/office/drawing/2015/9/8/chartex" xmlns:cx2="http://schemas.microsoft.com/office/drawing/2015/10/21/chartex" xmlns:cx3="http://schemas.microsoft.com/office/drawing/2016/5/9/chartex" xmlns:cx4="http://schemas.microsoft.com/office/drawing/2016/5/10/chartex" xmlns:cx5="http://schemas.microsoft.com/office/drawing/2016/5/11/chartex" xmlns:cx6="http://schemas.microsoft.com/office/drawing/2016/5/12/chartex" xmlns:cx7="http://schemas.microsoft.com/office/drawing/2016/5/13/chartex" xmlns:cx8="http://schemas.microsoft.com/office/drawing/2016/5/14/chartex" xmlns:mc="http://schemas.openxmlformats.org/markup-compatibility/2006" xmlns:aink="http://schemas.microsoft.com/office/drawing/2016/ink" xmlns:am3d="http://schemas.microsoft.com/office/drawing/2017/model3d" xmlns:o="urn:schemas-microsoft-com:office:office" xmlns:oel="http://schemas.microsoft.com/office/2019/extlst" xmlns:r="http://schemas.openxmlformats.org/officeDocument/2006/relationships" xmlns:m="http://schemas.openxmlformats.org/officeDocument/2006/math" xmlns:v="urn:schemas-microsoft-com:vml" xmlns:wp14="http://schemas.microsoft.com/office/word/2010/wordprocessingDrawing" xmlns:wp="http://schemas.openxmlformats.org/drawingml/2006/wordprocessingDrawing" xmlns:w10="urn:schemas-microsoft-com:office:word" xmlns:w="http://schemas.openxmlformats.org/wordprocessingml/2006/main" xmlns:w14="http://schemas.microsoft.com/office/word/2010/wordml" xmlns:w15="http://schemas.microsoft.com/office/word/2012/wordml" xmlns:w16cei="http://schemas.microsoft.com/office/word/2026/wordml/cei" xmlns:w16cex="http://schemas.microsoft.com/office/word/2018/wordml/cex" xmlns:w16cid="http://schemas.microsoft.com/office/word/2016/wordml/cid" xmlns:w16="http://schemas.microsoft.com/office/word/2018/wordml" xmlns:w16du="http://schemas.microsoft.com/office/word/2023/wordml/word16du" xmlns:w16sdtdh="http://schemas.microsoft.com/office/word/2020/wordml/sdtdatahash" xmlns:w16sdtfl="http://schemas.microsoft.com/office/word/2024/wordml/sdtformatlock" xmlns:w16se="http://schemas.microsoft.com/office/word/2015/wordml/symex" xmlns:wpg="http://schemas.microsoft.com/office/word/2010/wordprocessingGroup" xmlns:wpi="http://schemas.microsoft.com/office/word/2010/wordprocessingInk" xmlns:wne="http://schemas.microsoft.com/office/word/2006/wordml" xmlns:wps="http://schemas.microsoft.com/office/word/2010/wordprocessingShape" mc:Ignorable="w14 w15 w16se w16cid w16 w16cex w16sdtdh w16sdtfl w16du wp14">
   <w:body>
     <w:p>
+      <w:pPr>
+        <w:rPr>
+          <w:b/>
+          <w:bCs/>
+        </w:rPr>
+      </w:pPr>
       <w:r>
         <w:rPr>
           <w:b/>
@@ -13,6 +19,32 @@
     </w:p>
     <w:p>
       <w:r>
+        <w:rPr>
+          <w:b/>
+          <w:bCs/>
+        </w:rPr>
+        <w:t xml:space="preserve">Link github: </w:t>
+      </w:r>
+      <w:hyperlink r:id="rId4" w:history="1">
+        <w:r>
+          <w:rPr>
+            <w:rStyle w:val="Hyperlink"/>
+            <w:b/>
+            <w:bCs/>
+          </w:rPr>
+          <w:t>https://github.com/trantuanhung1209/React_Native_Lab/tree/main/Lab06</w:t>
+        </w:r>
+      </w:hyperlink>
+      <w:r>
+        <w:rPr>
+          <w:b/>
+          <w:bCs/>
+        </w:rPr>
+        <w:t xml:space="preserve"> </w:t>
+      </w:r>
+    </w:p>
+    <w:p>
+      <w:r>
         <w:t>Bai1:</w:t>
       </w:r>
     </w:p>
@@ -34,7 +66,7 @@
                     <pic:cNvPicPr/>
                   </pic:nvPicPr>
                   <pic:blipFill>
-                    <a:blip r:embed="rId4"/>
+                    <a:blip r:embed="rId5"/>
                     <a:stretch>
                       <a:fillRect/>
                     </a:stretch>
@@ -73,7 +105,7 @@
                     <pic:cNvPicPr/>
                   </pic:nvPicPr>
                   <pic:blipFill>
-                    <a:blip r:embed="rId5"/>
+                    <a:blip r:embed="rId6"/>
                     <a:stretch>
                       <a:fillRect/>
                     </a:stretch>
@@ -113,7 +145,7 @@
                     <pic:cNvPicPr/>
                   </pic:nvPicPr>
                   <pic:blipFill>
-                    <a:blip r:embed="rId6"/>
+                    <a:blip r:embed="rId7"/>
                     <a:stretch>
                       <a:fillRect/>
                     </a:stretch>
@@ -152,7 +184,7 @@
                     <pic:cNvPicPr/>
                   </pic:nvPicPr>
                   <pic:blipFill>
-                    <a:blip r:embed="rId7"/>
+                    <a:blip r:embed="rId8"/>
                     <a:stretch>
                       <a:fillRect/>
                     </a:stretch>
@@ -192,7 +224,7 @@
                     <pic:cNvPicPr/>
                   </pic:nvPicPr>
                   <pic:blipFill>
-                    <a:blip r:embed="rId8"/>
+                    <a:blip r:embed="rId9"/>
                     <a:stretch>
                       <a:fillRect/>
                     </a:stretch>
@@ -231,7 +263,7 @@
                     <pic:cNvPicPr/>
                   </pic:nvPicPr>
                   <pic:blipFill>
-                    <a:blip r:embed="rId9"/>
+                    <a:blip r:embed="rId10"/>
                     <a:stretch>
                       <a:fillRect/>
                     </a:stretch>
@@ -271,7 +303,7 @@
                     <pic:cNvPicPr/>
                   </pic:nvPicPr>
                   <pic:blipFill>
-                    <a:blip r:embed="rId10"/>
+                    <a:blip r:embed="rId11"/>
                     <a:stretch>
                       <a:fillRect/>
                     </a:stretch>
@@ -315,7 +347,7 @@
                     <pic:cNvPicPr/>
                   </pic:nvPicPr>
                   <pic:blipFill>
-                    <a:blip r:embed="rId11"/>
+                    <a:blip r:embed="rId12"/>
                     <a:stretch>
                       <a:fillRect/>
                     </a:stretch>
@@ -355,7 +387,7 @@
                     <pic:cNvPicPr/>
                   </pic:nvPicPr>
                   <pic:blipFill>
-                    <a:blip r:embed="rId12"/>
+                    <a:blip r:embed="rId13"/>
                     <a:stretch>
                       <a:fillRect/>
                     </a:stretch>
@@ -394,7 +426,7 @@
                     <pic:cNvPicPr/>
                   </pic:nvPicPr>
                   <pic:blipFill>
-                    <a:blip r:embed="rId13"/>
+                    <a:blip r:embed="rId14"/>
                     <a:stretch>
                       <a:fillRect/>
                     </a:stretch>
@@ -434,7 +466,7 @@
                     <pic:cNvPicPr/>
                   </pic:nvPicPr>
                   <pic:blipFill>
-                    <a:blip r:embed="rId14"/>
+                    <a:blip r:embed="rId15"/>
                     <a:stretch>
                       <a:fillRect/>
                     </a:stretch>
@@ -473,7 +505,7 @@
                     <pic:cNvPicPr/>
                   </pic:nvPicPr>
                   <pic:blipFill>
-                    <a:blip r:embed="rId15"/>
+                    <a:blip r:embed="rId16"/>
                     <a:stretch>
                       <a:fillRect/>
                     </a:stretch>
@@ -518,7 +550,7 @@
                     <pic:cNvPicPr/>
                   </pic:nvPicPr>
                   <pic:blipFill>
-                    <a:blip r:embed="rId16"/>
+                    <a:blip r:embed="rId17"/>
                     <a:stretch>
                       <a:fillRect/>
                     </a:stretch>
@@ -557,7 +589,7 @@
                     <pic:cNvPicPr/>
                   </pic:nvPicPr>
                   <pic:blipFill>
-                    <a:blip r:embed="rId17"/>
+                    <a:blip r:embed="rId18"/>
                     <a:stretch>
                       <a:fillRect/>
                     </a:stretch>
@@ -597,7 +629,7 @@
                     <pic:cNvPicPr/>
                   </pic:nvPicPr>
                   <pic:blipFill>
-                    <a:blip r:embed="rId18"/>
+                    <a:blip r:embed="rId19"/>
                     <a:stretch>
                       <a:fillRect/>
                     </a:stretch>
@@ -636,7 +668,7 @@
                     <pic:cNvPicPr/>
                   </pic:nvPicPr>
                   <pic:blipFill>
-                    <a:blip r:embed="rId19"/>
+                    <a:blip r:embed="rId20"/>
                     <a:stretch>
                       <a:fillRect/>
                     </a:stretch>
@@ -676,7 +708,7 @@
                     <pic:cNvPicPr/>
                   </pic:nvPicPr>
                   <pic:blipFill>
-                    <a:blip r:embed="rId20"/>
+                    <a:blip r:embed="rId21"/>
                     <a:stretch>
                       <a:fillRect/>
                     </a:stretch>
@@ -715,7 +747,7 @@
                     <pic:cNvPicPr/>
                   </pic:nvPicPr>
                   <pic:blipFill>
-                    <a:blip r:embed="rId21"/>
+                    <a:blip r:embed="rId22"/>
                     <a:stretch>
                       <a:fillRect/>
                     </a:stretch>
@@ -755,7 +787,7 @@
                     <pic:cNvPicPr/>
                   </pic:nvPicPr>
                   <pic:blipFill>
-                    <a:blip r:embed="rId22"/>
+                    <a:blip r:embed="rId23"/>
                     <a:stretch>
                       <a:fillRect/>
                     </a:stretch>
@@ -800,7 +832,7 @@
                     <pic:cNvPicPr/>
                   </pic:nvPicPr>
                   <pic:blipFill>
-                    <a:blip r:embed="rId23"/>
+                    <a:blip r:embed="rId24"/>
                     <a:stretch>
                       <a:fillRect/>
                     </a:stretch>
@@ -844,7 +876,7 @@
                     <pic:cNvPicPr/>
                   </pic:nvPicPr>
                   <pic:blipFill>
-                    <a:blip r:embed="rId24"/>
+                    <a:blip r:embed="rId25"/>
                     <a:stretch>
                       <a:fillRect/>
                     </a:stretch>
@@ -884,7 +916,7 @@
                     <pic:cNvPicPr/>
                   </pic:nvPicPr>
                   <pic:blipFill>
-                    <a:blip r:embed="rId25"/>
+                    <a:blip r:embed="rId26"/>
                     <a:stretch>
                       <a:fillRect/>
                     </a:stretch>
@@ -923,7 +955,7 @@
                     <pic:cNvPicPr/>
                   </pic:nvPicPr>
                   <pic:blipFill>
-                    <a:blip r:embed="rId26"/>
+                    <a:blip r:embed="rId27"/>
                     <a:stretch>
                       <a:fillRect/>
                     </a:stretch>
@@ -963,7 +995,7 @@
                     <pic:cNvPicPr/>
                   </pic:nvPicPr>
                   <pic:blipFill>
-                    <a:blip r:embed="rId27"/>
+                    <a:blip r:embed="rId28"/>
                     <a:stretch>
                       <a:fillRect/>
                     </a:stretch>
@@ -1002,7 +1034,7 @@
                     <pic:cNvPicPr/>
                   </pic:nvPicPr>
                   <pic:blipFill>
-                    <a:blip r:embed="rId28"/>
+                    <a:blip r:embed="rId29"/>
                     <a:stretch>
                       <a:fillRect/>
                     </a:stretch>
@@ -1042,7 +1074,7 @@
                     <pic:cNvPicPr/>
                   </pic:nvPicPr>
                   <pic:blipFill>
-                    <a:blip r:embed="rId29"/>
+                    <a:blip r:embed="rId30"/>
                     <a:stretch>
                       <a:fillRect/>
                     </a:stretch>
@@ -1081,7 +1113,7 @@
                     <pic:cNvPicPr/>
                   </pic:nvPicPr>
                   <pic:blipFill>
-                    <a:blip r:embed="rId30"/>
+                    <a:blip r:embed="rId31"/>
                     <a:stretch>
                       <a:fillRect/>
                     </a:stretch>
@@ -1121,7 +1153,7 @@
                     <pic:cNvPicPr/>
                   </pic:nvPicPr>
                   <pic:blipFill>
-                    <a:blip r:embed="rId31"/>
+                    <a:blip r:embed="rId32"/>
                     <a:stretch>
                       <a:fillRect/>
                     </a:stretch>
@@ -1165,7 +1197,7 @@
                     <pic:cNvPicPr/>
                   </pic:nvPicPr>
                   <pic:blipFill>
-                    <a:blip r:embed="rId32"/>
+                    <a:blip r:embed="rId33"/>
                     <a:stretch>
                       <a:fillRect/>
                     </a:stretch>
@@ -1205,7 +1237,7 @@
                     <pic:cNvPicPr/>
                   </pic:nvPicPr>
                   <pic:blipFill>
-                    <a:blip r:embed="rId33"/>
+                    <a:blip r:embed="rId34"/>
                     <a:stretch>
                       <a:fillRect/>
                     </a:stretch>
@@ -1244,7 +1276,7 @@
                     <pic:cNvPicPr/>
                   </pic:nvPicPr>
                   <pic:blipFill>
-                    <a:blip r:embed="rId34"/>
+                    <a:blip r:embed="rId35"/>
                     <a:stretch>
                       <a:fillRect/>
                     </a:stretch>
@@ -1284,7 +1316,7 @@
                     <pic:cNvPicPr/>
                   </pic:nvPicPr>
                   <pic:blipFill>
-                    <a:blip r:embed="rId35"/>
+                    <a:blip r:embed="rId36"/>
                     <a:stretch>
                       <a:fillRect/>
                     </a:stretch>
@@ -1323,7 +1355,7 @@
                     <pic:cNvPicPr/>
                   </pic:nvPicPr>
                   <pic:blipFill>
-                    <a:blip r:embed="rId36"/>
+                    <a:blip r:embed="rId37"/>
                     <a:stretch>
                       <a:fillRect/>
                     </a:stretch>
@@ -1363,7 +1395,7 @@
                     <pic:cNvPicPr/>
                   </pic:nvPicPr>
                   <pic:blipFill>
-                    <a:blip r:embed="rId37"/>
+                    <a:blip r:embed="rId38"/>
                     <a:stretch>
                       <a:fillRect/>
                     </a:stretch>
@@ -2310,6 +2342,29 @@
       <w:spacing w:val="5"/>
     </w:rPr>
   </w:style>
+  <w:style w:type="character" w:styleId="Hyperlink">
+    <w:name w:val="Hyperlink"/>
+    <w:basedOn w:val="DefaultParagraphFont"/>
+    <w:uiPriority w:val="99"/>
+    <w:unhideWhenUsed/>
+    <w:rsid w:val="00E02B87"/>
+    <w:rPr>
+      <w:color w:val="0563C1" w:themeColor="hyperlink"/>
+      <w:u w:val="single"/>
+    </w:rPr>
+  </w:style>
+  <w:style w:type="character" w:styleId="UnresolvedMention">
+    <w:name w:val="Unresolved Mention"/>
+    <w:basedOn w:val="DefaultParagraphFont"/>
+    <w:uiPriority w:val="99"/>
+    <w:semiHidden/>
+    <w:unhideWhenUsed/>
+    <w:rsid w:val="00E02B87"/>
+    <w:rPr>
+      <w:color w:val="605E5C"/>
+      <w:shd w:val="clear" w:color="auto" w:fill="E1DFDD"/>
+    </w:rPr>
+  </w:style>
 </w:styles>
 </file>
 

</xml_diff>